<commit_message>
Deploy preview for PR 557 🛫
</commit_message>
<xml_diff>
--- a/pr-preview/pr-557/UCD-SeRG-Lab-Manual-tracked-changes.docx
+++ b/pr-preview/pr-557/UCD-SeRG-Lab-Manual-tracked-changes.docx
@@ -30977,7 +30977,7 @@
       </w:ins>
       <w:ins w:id="1088" w:author="PR Preview" w:date="2024-01-01T00:00:00Z">
         <w:r>
-          <w:t xml:space="preserve">dd872b4</w:t>
+          <w:t xml:space="preserve">a6268f6</w:t>
         </w:r>
       </w:ins>
     </w:p>
@@ -31005,7 +31005,7 @@
       </w:ins>
       <w:ins w:id="1089" w:author="PR Preview" w:date="2024-01-01T00:00:00Z">
         <w:r>
-          <w:t xml:space="preserve">dd872b471b8d55620608db8a5f56db0c75936d91</w:t>
+          <w:t xml:space="preserve">a6268f6307948e63e9c99c9efcaead706c6030e9</w:t>
         </w:r>
       </w:ins>
     </w:p>
@@ -31033,7 +31033,7 @@
       </w:ins>
       <w:ins w:id="1090" w:author="PR Preview" w:date="2024-01-01T00:00:00Z">
         <w:r>
-          <w:t xml:space="preserve">2026-10-12 07:37:37 +0000</w:t>
+          <w:t xml:space="preserve">2026-10-12 07:46:21 +0000</w:t>
         </w:r>
       </w:ins>
     </w:p>

</xml_diff>